<commit_message>
docs(lab4): separate brightness matrix into distinct section 2 with dedicated screenshot
</commit_message>
<xml_diff>
--- a/lab4/Лабораторна робота 4 Графіка.docx
+++ b/lab4/Лабораторна робота 4 Графіка.docx
@@ -4,7 +4,7 @@
   <w:body>
     <w:p>
       <w:pPr>
-        <w:spacing w:after="120" w:line="276" w:lineRule="auto"/>
+        <w:spacing w:after="0" w:line="276" w:lineRule="auto"/>
         <w:jc w:val="center"/>
       </w:pPr>
       <w:r>
@@ -18,7 +18,7 @@
     </w:p>
     <w:p>
       <w:pPr>
-        <w:spacing w:after="120" w:line="276" w:lineRule="auto"/>
+        <w:spacing w:after="0" w:line="276" w:lineRule="auto"/>
         <w:jc w:val="center"/>
       </w:pPr>
       <w:r>
@@ -32,14 +32,14 @@
     </w:p>
     <w:p>
       <w:pPr>
-        <w:spacing w:after="1000" w:line="276" w:lineRule="auto"/>
+        <w:spacing w:after="720" w:line="276" w:lineRule="auto"/>
         <w:jc w:val="center"/>
       </w:pPr>
       <w:r>
         <w:rPr>
           <w:rFonts w:ascii="Times New Roman" w:hAnsi="Times New Roman"/>
           <w:b w:val="0"/>
-          <w:sz w:val="24"/>
+          <w:sz w:val="28"/>
         </w:rPr>
         <w:t>Факультет інформаційних технологій</w:t>
         <w:br/>
@@ -48,21 +48,7 @@
     </w:p>
     <w:p>
       <w:pPr>
-        <w:spacing w:after="120" w:line="276" w:lineRule="auto"/>
-        <w:jc w:val="center"/>
-      </w:pPr>
-      <w:r>
-        <w:rPr>
-          <w:rFonts w:ascii="Times New Roman" w:hAnsi="Times New Roman"/>
-          <w:b/>
-          <w:sz w:val="40"/>
-        </w:rPr>
-        <w:t>ЗВІТ</w:t>
-      </w:r>
-    </w:p>
-    <w:p>
-      <w:pPr>
-        <w:spacing w:after="400" w:line="276" w:lineRule="auto"/>
+        <w:spacing w:after="0" w:line="276" w:lineRule="auto"/>
         <w:jc w:val="center"/>
       </w:pPr>
       <w:r>
@@ -71,12 +57,26 @@
           <w:b/>
           <w:sz w:val="32"/>
         </w:rPr>
+        <w:t>ЗВІТ</w:t>
+      </w:r>
+    </w:p>
+    <w:p>
+      <w:pPr>
+        <w:spacing w:after="360" w:line="276" w:lineRule="auto"/>
+        <w:jc w:val="center"/>
+      </w:pPr>
+      <w:r>
+        <w:rPr>
+          <w:rFonts w:ascii="Times New Roman" w:hAnsi="Times New Roman"/>
+          <w:b/>
+          <w:sz w:val="28"/>
+        </w:rPr>
         <w:t>з лабораторної роботи №4</w:t>
       </w:r>
     </w:p>
     <w:p>
       <w:pPr>
-        <w:spacing w:after="600" w:line="276" w:lineRule="auto"/>
+        <w:spacing w:after="360" w:line="276" w:lineRule="auto"/>
         <w:jc w:val="center"/>
       </w:pPr>
       <w:r>
@@ -96,14 +96,14 @@
     </w:p>
     <w:p>
       <w:pPr>
-        <w:spacing w:after="1200" w:line="276" w:lineRule="auto"/>
+        <w:spacing w:after="960" w:line="276" w:lineRule="auto"/>
         <w:jc w:val="center"/>
       </w:pPr>
       <w:r>
         <w:rPr>
           <w:rFonts w:ascii="Times New Roman" w:hAnsi="Times New Roman"/>
           <w:b w:val="0"/>
-          <w:sz w:val="24"/>
+          <w:sz w:val="28"/>
         </w:rPr>
         <w:t>Дисципліна: «Комп'ютерна графіка та візуалізація»</w:t>
         <w:br/>
@@ -112,14 +112,13 @@
     </w:p>
     <w:p>
       <w:pPr>
-        <w:spacing w:after="1400" w:line="276" w:lineRule="auto"/>
+        <w:spacing w:after="960" w:line="276" w:lineRule="auto"/>
         <w:jc w:val="right"/>
       </w:pPr>
       <w:r>
         <w:rPr>
           <w:rFonts w:ascii="Times New Roman" w:hAnsi="Times New Roman"/>
-          <w:b w:val="0"/>
-          <w:sz w:val="24"/>
+          <w:sz w:val="28"/>
         </w:rPr>
         <w:t>Виконав(ла): Сивопляс Максим</w:t>
         <w:br/>
@@ -131,14 +130,14 @@
     </w:p>
     <w:p>
       <w:pPr>
-        <w:spacing w:after="120" w:line="276" w:lineRule="auto"/>
+        <w:spacing w:after="240" w:line="276" w:lineRule="auto"/>
         <w:jc w:val="center"/>
       </w:pPr>
       <w:r>
         <w:rPr>
           <w:rFonts w:ascii="Times New Roman" w:hAnsi="Times New Roman"/>
           <w:b w:val="0"/>
-          <w:sz w:val="24"/>
+          <w:sz w:val="28"/>
         </w:rPr>
         <w:t>Київ — 2026</w:t>
       </w:r>
@@ -150,8 +149,8 @@
     </w:p>
     <w:p>
       <w:pPr>
-        <w:spacing w:after="240" w:line="276" w:lineRule="auto"/>
-        <w:jc w:val="center"/>
+        <w:spacing w:after="120" w:line="276" w:lineRule="auto"/>
+        <w:jc w:val="left"/>
       </w:pPr>
       <w:r>
         <w:rPr>
@@ -171,63 +170,63 @@
         <w:rPr>
           <w:rFonts w:ascii="Times New Roman" w:hAnsi="Times New Roman"/>
           <w:b w:val="0"/>
-          <w:sz w:val="24"/>
+          <w:sz w:val="28"/>
         </w:rPr>
         <w:t>Для виконання лабораторної роботи можна використовувати будь-яку мову програмування та бібліотеки для роботи із зображеннями.</w:t>
       </w:r>
     </w:p>
     <w:p>
       <w:pPr>
-        <w:spacing w:after="120" w:line="276" w:lineRule="auto"/>
+        <w:spacing w:after="80" w:line="276" w:lineRule="auto"/>
         <w:jc w:val="left"/>
       </w:pPr>
       <w:r>
         <w:rPr>
           <w:rFonts w:ascii="Times New Roman" w:hAnsi="Times New Roman"/>
           <w:b w:val="0"/>
-          <w:sz w:val="24"/>
+          <w:sz w:val="28"/>
         </w:rPr>
         <w:t>1. Виведення первинного кольорового зображення на екран.</w:t>
       </w:r>
     </w:p>
     <w:p>
       <w:pPr>
-        <w:spacing w:after="120" w:line="276" w:lineRule="auto"/>
+        <w:spacing w:after="80" w:line="276" w:lineRule="auto"/>
         <w:jc w:val="left"/>
       </w:pPr>
       <w:r>
         <w:rPr>
           <w:rFonts w:ascii="Times New Roman" w:hAnsi="Times New Roman"/>
           <w:b w:val="0"/>
-          <w:sz w:val="24"/>
+          <w:sz w:val="28"/>
         </w:rPr>
         <w:t>2. Виведення на екран матриці значень яскравості зображення.</w:t>
       </w:r>
     </w:p>
     <w:p>
       <w:pPr>
-        <w:spacing w:after="120" w:line="276" w:lineRule="auto"/>
+        <w:spacing w:after="80" w:line="276" w:lineRule="auto"/>
         <w:jc w:val="left"/>
       </w:pPr>
       <w:r>
         <w:rPr>
           <w:rFonts w:ascii="Times New Roman" w:hAnsi="Times New Roman"/>
           <w:b w:val="0"/>
-          <w:sz w:val="24"/>
+          <w:sz w:val="28"/>
         </w:rPr>
         <w:t>3. Побудова гістограми яскравості кольорового зображення.</w:t>
       </w:r>
     </w:p>
     <w:p>
       <w:pPr>
-        <w:spacing w:after="280" w:line="276" w:lineRule="auto"/>
+        <w:spacing w:after="240" w:line="276" w:lineRule="auto"/>
         <w:jc w:val="left"/>
       </w:pPr>
       <w:r>
         <w:rPr>
           <w:rFonts w:ascii="Times New Roman" w:hAnsi="Times New Roman"/>
           <w:b w:val="0"/>
-          <w:sz w:val="24"/>
+          <w:sz w:val="28"/>
         </w:rPr>
         <w:t>4. Зміна кольоровості:</w:t>
         <w:br/>
@@ -242,56 +241,56 @@
     </w:p>
     <w:p>
       <w:pPr>
-        <w:spacing w:after="200" w:line="276" w:lineRule="auto"/>
+        <w:spacing w:after="240" w:line="276" w:lineRule="auto"/>
         <w:jc w:val="left"/>
       </w:pPr>
       <w:r>
         <w:rPr>
           <w:rFonts w:ascii="Times New Roman" w:hAnsi="Times New Roman"/>
           <w:b/>
-          <w:sz w:val="26"/>
+          <w:sz w:val="28"/>
         </w:rPr>
         <w:t>Опис ходу виконання завдань та використаних функцій</w:t>
       </w:r>
     </w:p>
     <w:p>
       <w:pPr>
-        <w:spacing w:after="120" w:line="276" w:lineRule="auto"/>
+        <w:spacing w:after="80" w:line="276" w:lineRule="auto"/>
         <w:jc w:val="left"/>
       </w:pPr>
       <w:r>
         <w:rPr>
           <w:rFonts w:ascii="Times New Roman" w:hAnsi="Times New Roman"/>
           <w:b/>
-          <w:sz w:val="24"/>
+          <w:sz w:val="28"/>
         </w:rPr>
-        <w:t>1. Виведення первинного кольорового зображення та розрахунок матриці яскравості</w:t>
+        <w:t>1. Виведення первинного кольорового зображення на екран</w:t>
       </w:r>
     </w:p>
     <w:p>
       <w:pPr>
-        <w:spacing w:after="120" w:line="276" w:lineRule="auto"/>
+        <w:spacing w:after="80" w:line="276" w:lineRule="auto"/>
         <w:jc w:val="left"/>
       </w:pPr>
       <w:r>
         <w:rPr>
           <w:rFonts w:ascii="Times New Roman" w:hAnsi="Times New Roman"/>
           <w:b w:val="0"/>
-          <w:sz w:val="24"/>
+          <w:sz w:val="28"/>
         </w:rPr>
-        <w:t>Хід виконання: Реалізовано зчитування графічного файлу у колірному просторі RGB та його відображення за допомогою Pillow і matplotlib. Розроблено власний попіксельний алгоритм розрахунку матриці яскравості за формулою люмінансу: Y = 0.299 * R + 0.587 * G + 0.114 * B. Забезпечено виведення фрагмента значень матриці у консоль та повне збереження у текстовий файл.</w:t>
+        <w:t>Хід виконання: Реалізовано зчитування графічного файлу у колірному просторі RGB та його відображення на екрані за допомогою Pillow і matplotlib у повному вихідному спектрі кольорів.</w:t>
       </w:r>
     </w:p>
     <w:p>
       <w:pPr>
-        <w:spacing w:after="120" w:line="276" w:lineRule="auto"/>
+        <w:spacing w:after="40" w:line="276" w:lineRule="auto"/>
         <w:jc w:val="left"/>
       </w:pPr>
       <w:r>
         <w:rPr>
           <w:rFonts w:ascii="Times New Roman" w:hAnsi="Times New Roman"/>
-          <w:b w:val="0"/>
-          <w:sz w:val="24"/>
+          <w:b/>
+          <w:sz w:val="28"/>
         </w:rPr>
         <w:t>Використані функції:</w:t>
       </w:r>
@@ -305,26 +304,20 @@
         <w:rPr>
           <w:rFonts w:ascii="Times New Roman" w:hAnsi="Times New Roman"/>
           <w:b w:val="0"/>
-          <w:sz w:val="22"/>
+          <w:sz w:val="28"/>
         </w:rPr>
-        <w:t>• load_image(), display_image() (Pillow, matplotlib) — завантаження та візуалізація первинного зображення.</w:t>
-        <w:br/>
-        <w:t>• calculate_pixel_brightness(), calculate_brightness_matrix() — власні алгоритми обчислення значень яскравості Y для кожного пікселя та формування двовимірної матриці.</w:t>
-        <w:br/>
-        <w:t>• get_brightness_matrix_info() — експорт повної матриці у файл та формування демонстраційного зрізу.</w:t>
+        <w:t>• load_image(), display_image() (Pillow, matplotlib) — завантаження у колірному форматі RGB та графічна візуалізація первинного зображення на екрані.</w:t>
       </w:r>
     </w:p>
     <w:p>
       <w:pPr>
-        <w:spacing w:after="280"/>
+        <w:spacing w:after="240"/>
         <w:jc w:val="center"/>
       </w:pPr>
-    </w:p>
-    <w:p>
       <w:r>
         <w:drawing>
           <wp:inline xmlns:a="http://schemas.openxmlformats.org/drawingml/2006/main" xmlns:pic="http://schemas.openxmlformats.org/drawingml/2006/picture">
-            <wp:extent cx="5303520" cy="2243796"/>
+            <wp:extent cx="5669280" cy="2349069"/>
             <wp:docPr id="1" name="Picture 1"/>
             <wp:cNvGraphicFramePr>
               <a:graphicFrameLocks noChangeAspect="1"/>
@@ -333,7 +326,7 @@
               <a:graphicData uri="http://schemas.openxmlformats.org/drawingml/2006/picture">
                 <pic:pic>
                   <pic:nvPicPr>
-                    <pic:cNvPr id="0" name="lab4_image1.png"/>
+                    <pic:cNvPr id="0" name="task1_display.png"/>
                     <pic:cNvPicPr/>
                   </pic:nvPicPr>
                   <pic:blipFill>
@@ -345,7 +338,7 @@
                   <pic:spPr>
                     <a:xfrm>
                       <a:off x="0" y="0"/>
-                      <a:ext cx="5303520" cy="2243796"/>
+                      <a:ext cx="5669280" cy="2349069"/>
                     </a:xfrm>
                     <a:prstGeom prst="rect"/>
                   </pic:spPr>
@@ -358,42 +351,42 @@
     </w:p>
     <w:p>
       <w:pPr>
-        <w:spacing w:after="120" w:line="276" w:lineRule="auto"/>
+        <w:spacing w:after="80" w:line="276" w:lineRule="auto"/>
         <w:jc w:val="left"/>
       </w:pPr>
       <w:r>
         <w:rPr>
           <w:rFonts w:ascii="Times New Roman" w:hAnsi="Times New Roman"/>
           <w:b/>
-          <w:sz w:val="24"/>
+          <w:sz w:val="28"/>
         </w:rPr>
-        <w:t>2. Побудова гістограми яскравості кольорового зображення</w:t>
+        <w:t>2. Виведення на екран матриці значень яскравості зображення</w:t>
       </w:r>
     </w:p>
     <w:p>
       <w:pPr>
-        <w:spacing w:after="120" w:line="276" w:lineRule="auto"/>
+        <w:spacing w:after="80" w:line="276" w:lineRule="auto"/>
         <w:jc w:val="left"/>
       </w:pPr>
       <w:r>
         <w:rPr>
           <w:rFonts w:ascii="Times New Roman" w:hAnsi="Times New Roman"/>
           <w:b w:val="0"/>
-          <w:sz w:val="24"/>
+          <w:sz w:val="28"/>
         </w:rPr>
-        <w:t>Хід виконання: Розроблено алгоритм статистичного підрахунку частот розподілу інтенсивностей для 256 рівнів (0..255). Реалізовано побудову 4 окремих графіків: для червоного (R), зеленого (G), синього (B) каналів та загальної яскравості (Luminance Y) без використання сторонніх функцій розрахунку гістограм.</w:t>
+        <w:t>Хід виконання: Розроблено власний попіксельний алгоритм розрахунку матриці яскравості за формулою люмінансу ITU-R BT.601: Y = 0.299 * R + 0.587 * G + 0.114 * B. Забезпечено виведення фрагмента значень матриці у консоль та збереження повної числової матриці у текстовий файл.</w:t>
       </w:r>
     </w:p>
     <w:p>
       <w:pPr>
-        <w:spacing w:after="120" w:line="276" w:lineRule="auto"/>
+        <w:spacing w:after="40" w:line="276" w:lineRule="auto"/>
         <w:jc w:val="left"/>
       </w:pPr>
       <w:r>
         <w:rPr>
           <w:rFonts w:ascii="Times New Roman" w:hAnsi="Times New Roman"/>
-          <w:b w:val="0"/>
-          <w:sz w:val="24"/>
+          <w:b/>
+          <w:sz w:val="28"/>
         </w:rPr>
         <w:t>Використані функції:</w:t>
       </w:r>
@@ -407,26 +400,22 @@
         <w:rPr>
           <w:rFonts w:ascii="Times New Roman" w:hAnsi="Times New Roman"/>
           <w:b w:val="0"/>
-          <w:sz w:val="22"/>
+          <w:sz w:val="28"/>
         </w:rPr>
-        <w:t>• build_histogram() — власний алгоритм підрахунку частотного розподілу пікселів для діапазону значень 0..255.</w:t>
+        <w:t>• calculate_pixel_brightness(), calculate_brightness_matrix() — власні алгоритми обчислення значень яскравості Y для кожного пікселя та формування двовимірної числової матриці розміром Height x Width.</w:t>
         <w:br/>
-        <w:t>• plt.subplots(), ax.bar(), plt.savefig() (matplotlib) — візуалізація та збереження графіків гістограм у файл PNG.</w:t>
-        <w:br/>
-        <w:t>• plot_color_histogram() — координація попіксельного збору даних та графічного відображення.</w:t>
+        <w:t>• get_brightness_matrix_info() — експорт повної матриці у файл brightness_matrix.txt та виведення репрезентативного фрагмента значень у консоль.</w:t>
       </w:r>
     </w:p>
     <w:p>
       <w:pPr>
-        <w:spacing w:after="280"/>
+        <w:spacing w:after="240"/>
         <w:jc w:val="center"/>
       </w:pPr>
-    </w:p>
-    <w:p>
       <w:r>
         <w:drawing>
           <wp:inline xmlns:a="http://schemas.openxmlformats.org/drawingml/2006/main" xmlns:pic="http://schemas.openxmlformats.org/drawingml/2006/picture">
-            <wp:extent cx="5303520" cy="1291883"/>
+            <wp:extent cx="5669280" cy="3109610"/>
             <wp:docPr id="2" name="Picture 2"/>
             <wp:cNvGraphicFramePr>
               <a:graphicFrameLocks noChangeAspect="1"/>
@@ -435,7 +424,7 @@
               <a:graphicData uri="http://schemas.openxmlformats.org/drawingml/2006/picture">
                 <pic:pic>
                   <pic:nvPicPr>
-                    <pic:cNvPr id="0" name="lab4_image2.png"/>
+                    <pic:cNvPr id="0" name="task2_matrix.png"/>
                     <pic:cNvPicPr/>
                   </pic:nvPicPr>
                   <pic:blipFill>
@@ -447,7 +436,7 @@
                   <pic:spPr>
                     <a:xfrm>
                       <a:off x="0" y="0"/>
-                      <a:ext cx="5303520" cy="1291883"/>
+                      <a:ext cx="5669280" cy="3109610"/>
                     </a:xfrm>
                     <a:prstGeom prst="rect"/>
                   </pic:spPr>
@@ -460,42 +449,42 @@
     </w:p>
     <w:p>
       <w:pPr>
-        <w:spacing w:after="120" w:line="276" w:lineRule="auto"/>
+        <w:spacing w:after="80" w:line="276" w:lineRule="auto"/>
         <w:jc w:val="left"/>
       </w:pPr>
       <w:r>
         <w:rPr>
           <w:rFonts w:ascii="Times New Roman" w:hAnsi="Times New Roman"/>
           <w:b/>
-          <w:sz w:val="24"/>
+          <w:sz w:val="28"/>
         </w:rPr>
-        <w:t>3. Зміна кольоровості (бінаризація, відтінки сірого, негатив та гістограма сірого)</w:t>
+        <w:t>3. Побудова гістограми яскравості кольорового зображення</w:t>
       </w:r>
     </w:p>
     <w:p>
       <w:pPr>
-        <w:spacing w:after="120" w:line="276" w:lineRule="auto"/>
+        <w:spacing w:after="80" w:line="276" w:lineRule="auto"/>
         <w:jc w:val="left"/>
       </w:pPr>
       <w:r>
         <w:rPr>
           <w:rFonts w:ascii="Times New Roman" w:hAnsi="Times New Roman"/>
           <w:b w:val="0"/>
-          <w:sz w:val="24"/>
+          <w:sz w:val="28"/>
         </w:rPr>
-        <w:t>Хід виконання: Реалізовано комплекс методів трансформації кольорових характеристик: перетворення у відтінки сірого шляхом дублювання розрахованого значення яскравості по всіх трьох каналах (R = G = B = Y); порогову бінаризацію за правилом порівняння яскравості з порогом P (Y &gt; P -&gt; 255, інакше 0); створення фотографічного негативу заміною значення кожного каналу на його доповнення (255 - C); та побудову гістограми для отриманого монохромного зображення.</w:t>
+        <w:t>Хід виконання: Розроблено алгоритм статистичного підрахунку частот розподілу інтенсивностей для 256 рівнів (0..255). Реалізовано побудову 4 окремих графіків: для червоного (R), зеленого (G), синього (B) каналів та інтегральної яскравості (Luminance Y) без використання сторонніх функцій розрахунку гістограм.</w:t>
       </w:r>
     </w:p>
     <w:p>
       <w:pPr>
-        <w:spacing w:after="120" w:line="276" w:lineRule="auto"/>
+        <w:spacing w:after="40" w:line="276" w:lineRule="auto"/>
         <w:jc w:val="left"/>
       </w:pPr>
       <w:r>
         <w:rPr>
           <w:rFonts w:ascii="Times New Roman" w:hAnsi="Times New Roman"/>
-          <w:b w:val="0"/>
-          <w:sz w:val="24"/>
+          <w:b/>
+          <w:sz w:val="28"/>
         </w:rPr>
         <w:t>Використані функції:</w:t>
       </w:r>
@@ -509,28 +498,24 @@
         <w:rPr>
           <w:rFonts w:ascii="Times New Roman" w:hAnsi="Times New Roman"/>
           <w:b w:val="0"/>
-          <w:sz w:val="22"/>
+          <w:sz w:val="28"/>
         </w:rPr>
-        <w:t>• to_grayscale() — власний алгоритм монохроматизації пікселів.</w:t>
+        <w:t>• build_histogram() — власний алгоритм підрахунку частотного розподілу пікселів для діапазону значень 0..255.</w:t>
         <w:br/>
-        <w:t>• binarize() — власний алгоритм порогової бінаризації зображення.</w:t>
+        <w:t>• plt.subplots(), ax.bar(), plt.savefig() (matplotlib) — візуалізація та збереження графіків гістограм у файл PNG.</w:t>
         <w:br/>
-        <w:t>• to_negative() — власна функція попіксельної інверсії кольору.</w:t>
-        <w:br/>
-        <w:t>• plot_grayscale_histogram(), apply_color_transformations() — функції збереження трансформованих зображень та побудови гістограми відтінків сірого.</w:t>
+        <w:t>• plot_color_histogram() — координація попіксельного збору даних та графічного відображення.</w:t>
       </w:r>
     </w:p>
     <w:p>
       <w:pPr>
-        <w:spacing w:after="280"/>
+        <w:spacing w:after="240"/>
         <w:jc w:val="center"/>
       </w:pPr>
-    </w:p>
-    <w:p>
       <w:r>
         <w:drawing>
           <wp:inline xmlns:a="http://schemas.openxmlformats.org/drawingml/2006/main" xmlns:pic="http://schemas.openxmlformats.org/drawingml/2006/picture">
-            <wp:extent cx="5303520" cy="1835834"/>
+            <wp:extent cx="5669280" cy="1380978"/>
             <wp:docPr id="3" name="Picture 3"/>
             <wp:cNvGraphicFramePr>
               <a:graphicFrameLocks noChangeAspect="1"/>
@@ -539,7 +524,7 @@
               <a:graphicData uri="http://schemas.openxmlformats.org/drawingml/2006/picture">
                 <pic:pic>
                   <pic:nvPicPr>
-                    <pic:cNvPr id="0" name="lab4_image3.png"/>
+                    <pic:cNvPr id="0" name="lab4_image2.png"/>
                     <pic:cNvPicPr/>
                   </pic:nvPicPr>
                   <pic:blipFill>
@@ -551,7 +536,7 @@
                   <pic:spPr>
                     <a:xfrm>
                       <a:off x="0" y="0"/>
-                      <a:ext cx="5303520" cy="1835834"/>
+                      <a:ext cx="5669280" cy="1380978"/>
                     </a:xfrm>
                     <a:prstGeom prst="rect"/>
                   </pic:spPr>
@@ -564,28 +549,132 @@
     </w:p>
     <w:p>
       <w:pPr>
-        <w:spacing w:after="280" w:line="276" w:lineRule="auto"/>
+        <w:spacing w:after="80" w:line="276" w:lineRule="auto"/>
         <w:jc w:val="left"/>
       </w:pPr>
       <w:r>
         <w:rPr>
           <w:rFonts w:ascii="Times New Roman" w:hAnsi="Times New Roman"/>
           <w:b/>
-          <w:sz w:val="24"/>
+          <w:sz w:val="28"/>
         </w:rPr>
-        <w:t>4. Лістинг програми з коментарями: https://github.com/max93139/Computer-Graphics_Labs_Maksym_Syvoplias</w:t>
+        <w:t>4. Зміна кольоровості (бінаризація, відтінки сірого, негатив та гістограма сірого)</w:t>
       </w:r>
     </w:p>
     <w:p>
       <w:pPr>
-        <w:spacing w:after="160" w:line="276" w:lineRule="auto"/>
+        <w:spacing w:after="80" w:line="276" w:lineRule="auto"/>
+        <w:jc w:val="left"/>
+      </w:pPr>
+      <w:r>
+        <w:rPr>
+          <w:rFonts w:ascii="Times New Roman" w:hAnsi="Times New Roman"/>
+          <w:b w:val="0"/>
+          <w:sz w:val="28"/>
+        </w:rPr>
+        <w:t>Хід виконання: Реалізовано комплекс методів трансформації кольорових характеристик із підтримкою окремого та пакетного виконання через інтерактивне підменю: порогову бінаризацію за правилом (Y &gt; P -&gt; 255, інакше 0); перетворення у відтінки сірого (R = G = B = Y); створення фотографічного негативу заміною значення кожного каналу на його доповнення (255 - C); та побудову гістограми для отриманого монохромного зображення.</w:t>
+      </w:r>
+    </w:p>
+    <w:p>
+      <w:pPr>
+        <w:spacing w:after="40" w:line="276" w:lineRule="auto"/>
         <w:jc w:val="left"/>
       </w:pPr>
       <w:r>
         <w:rPr>
           <w:rFonts w:ascii="Times New Roman" w:hAnsi="Times New Roman"/>
           <w:b/>
-          <w:sz w:val="26"/>
+          <w:sz w:val="28"/>
+        </w:rPr>
+        <w:t>Використані функції:</w:t>
+      </w:r>
+    </w:p>
+    <w:p>
+      <w:pPr>
+        <w:spacing w:after="120" w:line="276" w:lineRule="auto"/>
+        <w:jc w:val="left"/>
+      </w:pPr>
+      <w:r>
+        <w:rPr>
+          <w:rFonts w:ascii="Times New Roman" w:hAnsi="Times New Roman"/>
+          <w:b w:val="0"/>
+          <w:sz w:val="28"/>
+        </w:rPr>
+        <w:t>• binarize(), run_binarize() — порогова бінаризація зображення за заданим порогом P.</w:t>
+        <w:br/>
+        <w:t>• to_grayscale(), run_grayscale() — алгоритм монохроматизації пікселів.</w:t>
+        <w:br/>
+        <w:t>• to_negative(), run_negative() — попіксельна інверсія кольору.</w:t>
+        <w:br/>
+        <w:t>• plot_grayscale_histogram() — побудова гістограми відтінків сірого.</w:t>
+        <w:br/>
+        <w:t>• apply_color_transformations() — пакетне виконання всіх трансформацій кольоровості.</w:t>
+      </w:r>
+    </w:p>
+    <w:p>
+      <w:pPr>
+        <w:spacing w:after="240"/>
+        <w:jc w:val="center"/>
+      </w:pPr>
+      <w:r>
+        <w:drawing>
+          <wp:inline xmlns:a="http://schemas.openxmlformats.org/drawingml/2006/main" xmlns:pic="http://schemas.openxmlformats.org/drawingml/2006/picture">
+            <wp:extent cx="5669280" cy="1962443"/>
+            <wp:docPr id="4" name="Picture 4"/>
+            <wp:cNvGraphicFramePr>
+              <a:graphicFrameLocks noChangeAspect="1"/>
+            </wp:cNvGraphicFramePr>
+            <a:graphic>
+              <a:graphicData uri="http://schemas.openxmlformats.org/drawingml/2006/picture">
+                <pic:pic>
+                  <pic:nvPicPr>
+                    <pic:cNvPr id="0" name="lab4_image3.png"/>
+                    <pic:cNvPicPr/>
+                  </pic:nvPicPr>
+                  <pic:blipFill>
+                    <a:blip r:embed="rId12"/>
+                    <a:stretch>
+                      <a:fillRect/>
+                    </a:stretch>
+                  </pic:blipFill>
+                  <pic:spPr>
+                    <a:xfrm>
+                      <a:off x="0" y="0"/>
+                      <a:ext cx="5669280" cy="1962443"/>
+                    </a:xfrm>
+                    <a:prstGeom prst="rect"/>
+                  </pic:spPr>
+                </pic:pic>
+              </a:graphicData>
+            </a:graphic>
+          </wp:inline>
+        </w:drawing>
+      </w:r>
+    </w:p>
+    <w:p>
+      <w:pPr>
+        <w:spacing w:after="240" w:line="276" w:lineRule="auto"/>
+        <w:jc w:val="left"/>
+      </w:pPr>
+      <w:r>
+        <w:rPr>
+          <w:rFonts w:ascii="Times New Roman" w:hAnsi="Times New Roman"/>
+          <w:b/>
+          <w:sz w:val="28"/>
+        </w:rPr>
+        <w:t>5. Лістинг програми з коментарями: https://github.com/max93139/Computer-Graphics_Labs_Maksym_Syvoplias</w:t>
+      </w:r>
+    </w:p>
+    <w:p>
+      <w:pPr>
+        <w:spacing w:after="120" w:line="276" w:lineRule="auto"/>
+        <w:jc w:val="left"/>
+      </w:pPr>
+      <w:r>
+        <w:rPr>
+          <w:rFonts w:ascii="Times New Roman" w:hAnsi="Times New Roman"/>
+          <w:b/>
+          <w:sz w:val="28"/>
         </w:rPr>
         <w:t>Висновок</w:t>
       </w:r>
@@ -599,9 +688,9 @@
         <w:rPr>
           <w:rFonts w:ascii="Times New Roman" w:hAnsi="Times New Roman"/>
           <w:b w:val="0"/>
-          <w:sz w:val="24"/>
+          <w:sz w:val="28"/>
         </w:rPr>
-        <w:t>У ході лабораторної роботи було розроблено програму для обробки та аналізу кольорових зображень. Реалізовано виведення повнокольорового зображення, математичний розрахунок матриці люмінансу Y = 0.299*R + 0.587*G + 0.114*B, побудову гістограм розподілу інтенсивностей для кожного каналу та яскравості, а також виконання операцій зміни кольоровості: бінаризації за налаштовуваним порогом, переходу до відтінків сірого, інверсії в негатив та аналізу гістограми монохромного зображення. У процесі виконання роботи закріплено розуміння природи люмінансу, частотного розподілу графічних даних та методів порогової обробки.</w:t>
+        <w:t>У ході лабораторної роботи було розроблено програму для обробки та аналізу кольорових зображень. Реалізовано виведення повнокольорового зображення, математичний розрахунок матриці люмінансу Y = 0.299*R + 0.587*G + 0.114*B з виведенням на екран та експортом у текстовий файл, побудову гістограм розподілу інтенсивностей для кожного каналу та яскравості, а також виконання операцій зміни кольоровості: бінаризації за налаштовуваним порогом, переходу до відтінків сірого, інверсії в негатив та аналізу гістограми монохромного зображення як окремо через інтерактивне підменю, так і пакетом. У процесі виконання роботи закріплено розуміння природи люмінансу, частотного розподілу графічних даних та методів порогової обробки.</w:t>
       </w:r>
     </w:p>
     <w:sectPr>

</xml_diff>